<commit_message>
docs: update Akshar role title to remove Lead tag
</commit_message>
<xml_diff>
--- a/STRIDESENSE_TEAM4_REVIEW_PREPARATION.docx
+++ b/STRIDESENSE_TEAM4_REVIEW_PREPARATION.docx
@@ -620,7 +620,7 @@
                 <w:color w:val="0F766E"/>
                 <w:sz w:val="17"/>
               </w:rPr>
-              <w:t>Akshar (Lead)</w:t>
+              <w:t>Akshar</w:t>
             </w:r>
           </w:p>
         </w:tc>
@@ -1976,7 +1976,7 @@
           <w:color w:val="0F766E"/>
           <w:sz w:val="24"/>
         </w:rPr>
-        <w:t>★ AKSHAR (Team Lead) — Pillar 3: Edge Analytics, Feature Extraction &amp; TinyML Inference (5 Marks)</w:t>
+        <w:t>★ AKSHAR — Pillar 3: Edge Analytics, Feature Extraction &amp; TinyML Inference (5 Marks)</w:t>
       </w:r>
     </w:p>
     <w:p>
@@ -1996,7 +1996,7 @@
           <w:rFonts w:ascii="Arial" w:hAnsi="Arial"/>
           <w:sz w:val="19"/>
         </w:rPr>
-        <w:t>Akshar leads the overall system presentation and presents the Edge AI &amp; TinyML inference pipeline, signal processing, feature extraction, and dual-trigger fall detection engine.</w:t>
+        <w:t>Akshar presents the Edge AI &amp; TinyML inference pipeline, signal processing, feature extraction, and dual-trigger fall detection engine.</w:t>
       </w:r>
     </w:p>
     <w:tbl>
@@ -2041,7 +2041,7 @@
                 <w:color w:val="334155"/>
                 <w:sz w:val="18"/>
               </w:rPr>
-              <w:t>"Good morning evaluators. I am Akshar, team lead for Team 4. I will present our Edge Analytics &amp; Machine Learning Pipeline (Rubric 3) and oversee our system demonstration.</w:t>
+              <w:t>"Good morning evaluators. I am Akshar. I will present our Edge Analytics &amp; Machine Learning Pipeline (Rubric 3) and oversee our system demonstration.</w:t>
               <w:br/>
               <w:br/>
               <w:t>StrideSense runs real-time Artificial Intelligence directly on the ESP32 microcontroller at the edge. Our inference pipeline operates in three distinct phases: signal pre-processing, feature extraction, and quantized neural network inference.</w:t>
@@ -3073,7 +3073,7 @@
                 <w:color w:val="0F766E"/>
                 <w:sz w:val="17"/>
               </w:rPr>
-              <w:t>Akshar (Lead)</w:t>
+              <w:t>Akshar</w:t>
             </w:r>
           </w:p>
         </w:tc>

</xml_diff>